<commit_message>
implemented selection of LH vars for completeness analysis
</commit_message>
<xml_diff>
--- a/meeting-notes.docx
+++ b/meeting-notes.docx
@@ -2,6 +2,69 @@
 <file path=word/document.xml><?xml version="1.0" encoding="utf-8"?>
 <w:document xmlns:wpc="http://schemas.microsoft.com/office/word/2010/wordprocessingCanvas" xmlns:cx="http://schemas.microsoft.com/office/drawing/2014/chartex" xmlns:cx1="http://schemas.microsoft.com/office/drawing/2015/9/8/chartex" xmlns:cx2="http://schemas.microsoft.com/office/drawing/2015/10/21/chartex" xmlns:cx3="http://schemas.microsoft.com/office/drawing/2016/5/9/chartex" xmlns:cx4="http://schemas.microsoft.com/office/drawing/2016/5/10/chartex" xmlns:cx5="http://schemas.microsoft.com/office/drawing/2016/5/11/chartex" xmlns:cx6="http://schemas.microsoft.com/office/drawing/2016/5/12/chartex" xmlns:cx7="http://schemas.microsoft.com/office/drawing/2016/5/13/chartex" xmlns:cx8="http://schemas.microsoft.com/office/drawing/2016/5/14/chartex" xmlns:mc="http://schemas.openxmlformats.org/markup-compatibility/2006" xmlns:aink="http://schemas.microsoft.com/office/drawing/2016/ink" xmlns:am3d="http://schemas.microsoft.com/office/drawing/2017/model3d" xmlns:o="urn:schemas-microsoft-com:office:office" xmlns:oel="http://schemas.microsoft.com/office/2019/extlst" xmlns:r="http://schemas.openxmlformats.org/officeDocument/2006/relationships" xmlns:m="http://schemas.openxmlformats.org/officeDocument/2006/math" xmlns:v="urn:schemas-microsoft-com:vml" xmlns:wp14="http://schemas.microsoft.com/office/word/2010/wordprocessingDrawing" xmlns:wp="http://schemas.openxmlformats.org/drawingml/2006/wordprocessingDrawing" xmlns:w10="urn:schemas-microsoft-com:office:word" xmlns:w="http://schemas.openxmlformats.org/wordprocessingml/2006/main" xmlns:w14="http://schemas.microsoft.com/office/word/2010/wordml" xmlns:w15="http://schemas.microsoft.com/office/word/2012/wordml" xmlns:w16cex="http://schemas.microsoft.com/office/word/2018/wordml/cex" xmlns:w16cid="http://schemas.microsoft.com/office/word/2016/wordml/cid" xmlns:w16="http://schemas.microsoft.com/office/word/2018/wordml" xmlns:w16du="http://schemas.microsoft.com/office/word/2023/wordml/word16du" xmlns:w16sdtdh="http://schemas.microsoft.com/office/word/2020/wordml/sdtdatahash" xmlns:w16sdtfl="http://schemas.microsoft.com/office/word/2024/wordml/sdtformatlock" xmlns:w16se="http://schemas.microsoft.com/office/word/2015/wordml/symex" xmlns:wpg="http://schemas.microsoft.com/office/word/2010/wordprocessingGroup" xmlns:wpi="http://schemas.microsoft.com/office/word/2010/wordprocessingInk" xmlns:wne="http://schemas.microsoft.com/office/word/2006/wordml" xmlns:wps="http://schemas.microsoft.com/office/word/2010/wordprocessingShape" mc:Ignorable="w14 w15 w16se w16cid w16 w16cex w16sdtdh w16sdtfl w16du wp14">
   <w:body>
+    <w:p>
+      <w:pPr>
+        <w:rPr>
+          <w:b/>
+          <w:bCs/>
+        </w:rPr>
+      </w:pPr>
+      <w:r>
+        <w:rPr>
+          <w:b/>
+          <w:bCs/>
+        </w:rPr>
+        <w:t>MEETING NOTES LHDB NEW YEAR (date?)</w:t>
+      </w:r>
+    </w:p>
+    <w:p>
+      <w:pPr>
+        <w:pStyle w:val="ListParagraph"/>
+        <w:numPr>
+          <w:ilvl w:val="0"/>
+          <w:numId w:val="6"/>
+        </w:numPr>
+        <w:rPr>
+          <w:b/>
+          <w:bCs/>
+        </w:rPr>
+      </w:pPr>
+      <w:r>
+        <w:t>Progress report</w:t>
+      </w:r>
+    </w:p>
+    <w:p>
+      <w:pPr>
+        <w:pStyle w:val="ListParagraph"/>
+        <w:numPr>
+          <w:ilvl w:val="1"/>
+          <w:numId w:val="6"/>
+        </w:numPr>
+        <w:rPr>
+          <w:b/>
+          <w:bCs/>
+        </w:rPr>
+      </w:pPr>
+      <w:r>
+        <w:t>Overhauled variable comparison table</w:t>
+      </w:r>
+    </w:p>
+    <w:p>
+      <w:pPr>
+        <w:pStyle w:val="ListParagraph"/>
+        <w:numPr>
+          <w:ilvl w:val="1"/>
+          <w:numId w:val="6"/>
+        </w:numPr>
+        <w:rPr>
+          <w:b/>
+          <w:bCs/>
+        </w:rPr>
+      </w:pPr>
+      <w:r>
+        <w:t>(12.20) started heatmap analysis for completeness of select LH variables</w:t>
+      </w:r>
+    </w:p>
     <w:p>
       <w:pPr>
         <w:rPr>
@@ -18,8 +81,15 @@
       </w:r>
     </w:p>
     <w:p>
-      <w:r>
-        <w:t xml:space="preserve">- DB </w:t>
+      <w:pPr>
+        <w:pStyle w:val="ListParagraph"/>
+        <w:numPr>
+          <w:ilvl w:val="0"/>
+          <w:numId w:val="5"/>
+        </w:numPr>
+      </w:pPr>
+      <w:r>
+        <w:t xml:space="preserve">DB </w:t>
       </w:r>
       <w:proofErr w:type="spellStart"/>
       <w:r>
@@ -31,14 +101,20 @@
       </w:r>
     </w:p>
     <w:p>
-      <w:r>
-        <w:t xml:space="preserve">-- </w:t>
-      </w:r>
+      <w:pPr>
+        <w:pStyle w:val="ListParagraph"/>
+        <w:numPr>
+          <w:ilvl w:val="1"/>
+          <w:numId w:val="5"/>
+        </w:numPr>
+      </w:pPr>
       <w:proofErr w:type="spellStart"/>
+      <w:proofErr w:type="gramStart"/>
       <w:r>
         <w:t>dist</w:t>
       </w:r>
       <w:proofErr w:type="spellEnd"/>
+      <w:proofErr w:type="gramEnd"/>
       <w:r>
         <w:t xml:space="preserve"> from mean, which </w:t>
       </w:r>
@@ -48,17 +124,39 @@
       </w:r>
       <w:proofErr w:type="spellEnd"/>
       <w:r>
-        <w:t xml:space="preserve"> closest to mean? avg distance? </w:t>
-      </w:r>
-    </w:p>
-    <w:p>
-      <w:r>
-        <w:t>-- heat map of missing vars</w:t>
-      </w:r>
-    </w:p>
-    <w:p>
-      <w:r>
-        <w:t xml:space="preserve">-- identify papers that </w:t>
+        <w:t xml:space="preserve"> closest to mean? </w:t>
+      </w:r>
+      <w:proofErr w:type="gramStart"/>
+      <w:r>
+        <w:t>avg</w:t>
+      </w:r>
+      <w:proofErr w:type="gramEnd"/>
+      <w:r>
+        <w:t xml:space="preserve"> distance? </w:t>
+      </w:r>
+    </w:p>
+    <w:p>
+      <w:pPr>
+        <w:pStyle w:val="ListParagraph"/>
+        <w:numPr>
+          <w:ilvl w:val="1"/>
+          <w:numId w:val="5"/>
+        </w:numPr>
+      </w:pPr>
+      <w:r>
+        <w:t>heat map of missing vars</w:t>
+      </w:r>
+    </w:p>
+    <w:p>
+      <w:pPr>
+        <w:pStyle w:val="ListParagraph"/>
+        <w:numPr>
+          <w:ilvl w:val="1"/>
+          <w:numId w:val="5"/>
+        </w:numPr>
+      </w:pPr>
+      <w:r>
+        <w:t xml:space="preserve">identify papers that </w:t>
       </w:r>
       <w:proofErr w:type="spellStart"/>
       <w:r>
@@ -70,8 +168,20 @@
       </w:r>
     </w:p>
     <w:p>
-      <w:r>
-        <w:t xml:space="preserve">-- responsible uses of big data; validation tests? </w:t>
+      <w:pPr>
+        <w:pStyle w:val="ListParagraph"/>
+        <w:numPr>
+          <w:ilvl w:val="1"/>
+          <w:numId w:val="5"/>
+        </w:numPr>
+      </w:pPr>
+      <w:proofErr w:type="gramStart"/>
+      <w:r>
+        <w:t>responsible</w:t>
+      </w:r>
+      <w:proofErr w:type="gramEnd"/>
+      <w:r>
+        <w:t xml:space="preserve"> uses of big data; validation tests? </w:t>
       </w:r>
       <w:proofErr w:type="spellStart"/>
       <w:r>
@@ -96,9 +206,13 @@
       <w:proofErr w:type="spellEnd"/>
     </w:p>
     <w:p>
-      <w:r>
-        <w:t xml:space="preserve">-- </w:t>
-      </w:r>
+      <w:pPr>
+        <w:pStyle w:val="ListParagraph"/>
+        <w:numPr>
+          <w:ilvl w:val="1"/>
+          <w:numId w:val="5"/>
+        </w:numPr>
+      </w:pPr>
       <w:proofErr w:type="spellStart"/>
       <w:r>
         <w:t>panTHERIA</w:t>
@@ -153,8 +267,19 @@
       </w:r>
     </w:p>
     <w:p>
-      <w:r>
-        <w:t xml:space="preserve">- Which </w:t>
+      <w:pPr>
+        <w:pStyle w:val="ListParagraph"/>
+        <w:numPr>
+          <w:ilvl w:val="0"/>
+          <w:numId w:val="1"/>
+        </w:numPr>
+        <w:rPr>
+          <w:b/>
+          <w:bCs/>
+        </w:rPr>
+      </w:pPr>
+      <w:r>
+        <w:t xml:space="preserve">Which </w:t>
       </w:r>
       <w:proofErr w:type="spellStart"/>
       <w:r>
@@ -166,28 +291,83 @@
       </w:r>
     </w:p>
     <w:p>
-      <w:r>
-        <w:t>- Build qualitative assessments for ease of use of databases</w:t>
-      </w:r>
-    </w:p>
-    <w:p>
-      <w:r>
-        <w:t>- Table comparing definitions of common vars</w:t>
-      </w:r>
-    </w:p>
-    <w:p>
-      <w:r>
-        <w:t>- Max longevity vs expected life span at age of maturity</w:t>
-      </w:r>
-    </w:p>
-    <w:p>
-      <w:r>
-        <w:t>- UTILITY OF VARIABLES LIKE LITTER SIZE considering different strategies between sexes (caps)</w:t>
-      </w:r>
-    </w:p>
-    <w:p>
-      <w:r>
-        <w:t>- How to grade databases? Descriptive stats are nice but how do we apply value judgement?</w:t>
+      <w:pPr>
+        <w:pStyle w:val="ListParagraph"/>
+        <w:numPr>
+          <w:ilvl w:val="0"/>
+          <w:numId w:val="1"/>
+        </w:numPr>
+        <w:rPr>
+          <w:b/>
+          <w:bCs/>
+        </w:rPr>
+      </w:pPr>
+      <w:r>
+        <w:t>Build qualitative assessments for ease of use of databases</w:t>
+      </w:r>
+    </w:p>
+    <w:p>
+      <w:pPr>
+        <w:pStyle w:val="ListParagraph"/>
+        <w:numPr>
+          <w:ilvl w:val="0"/>
+          <w:numId w:val="1"/>
+        </w:numPr>
+        <w:rPr>
+          <w:b/>
+          <w:bCs/>
+        </w:rPr>
+      </w:pPr>
+      <w:r>
+        <w:t>Table comparing definitions of common vars</w:t>
+      </w:r>
+    </w:p>
+    <w:p>
+      <w:pPr>
+        <w:pStyle w:val="ListParagraph"/>
+        <w:numPr>
+          <w:ilvl w:val="0"/>
+          <w:numId w:val="1"/>
+        </w:numPr>
+        <w:rPr>
+          <w:b/>
+          <w:bCs/>
+        </w:rPr>
+      </w:pPr>
+      <w:r>
+        <w:t>Max longevity vs expected life span at age of maturity</w:t>
+      </w:r>
+    </w:p>
+    <w:p>
+      <w:pPr>
+        <w:pStyle w:val="ListParagraph"/>
+        <w:numPr>
+          <w:ilvl w:val="0"/>
+          <w:numId w:val="1"/>
+        </w:numPr>
+        <w:rPr>
+          <w:b/>
+          <w:bCs/>
+        </w:rPr>
+      </w:pPr>
+      <w:r>
+        <w:t>UTILITY OF VARIABLES LIKE LITTER SIZE considering different strategies between sexes (caps)</w:t>
+      </w:r>
+    </w:p>
+    <w:p>
+      <w:pPr>
+        <w:pStyle w:val="ListParagraph"/>
+        <w:numPr>
+          <w:ilvl w:val="0"/>
+          <w:numId w:val="1"/>
+        </w:numPr>
+        <w:rPr>
+          <w:b/>
+          <w:bCs/>
+        </w:rPr>
+      </w:pPr>
+      <w:r>
+        <w:t>How to grade databases? Descriptive stats are nice but how do we apply value judgement?</w:t>
       </w:r>
     </w:p>
     <w:p>
@@ -206,6 +386,13 @@
       </w:r>
     </w:p>
     <w:p>
+      <w:pPr>
+        <w:pStyle w:val="ListParagraph"/>
+        <w:numPr>
+          <w:ilvl w:val="0"/>
+          <w:numId w:val="2"/>
+        </w:numPr>
+      </w:pPr>
       <w:r>
         <w:t xml:space="preserve">!!!! check literature for existing </w:t>
       </w:r>
@@ -216,11 +403,25 @@
       <w:proofErr w:type="gramEnd"/>
     </w:p>
     <w:p>
+      <w:pPr>
+        <w:pStyle w:val="ListParagraph"/>
+        <w:numPr>
+          <w:ilvl w:val="0"/>
+          <w:numId w:val="2"/>
+        </w:numPr>
+      </w:pPr>
       <w:r>
         <w:t>poster product idea: qualitative analysis of variables used and best definitions</w:t>
       </w:r>
     </w:p>
     <w:p>
+      <w:pPr>
+        <w:pStyle w:val="ListParagraph"/>
+        <w:numPr>
+          <w:ilvl w:val="0"/>
+          <w:numId w:val="2"/>
+        </w:numPr>
+      </w:pPr>
       <w:r>
         <w:t xml:space="preserve">distances form </w:t>
       </w:r>
@@ -249,6 +450,703 @@
     </w:sectPr>
   </w:body>
 </w:document>
+</file>
+
+<file path=word/numbering.xml><?xml version="1.0" encoding="utf-8"?>
+<w:numbering xmlns:wpc="http://schemas.microsoft.com/office/word/2010/wordprocessingCanvas" xmlns:cx="http://schemas.microsoft.com/office/drawing/2014/chartex" xmlns:cx1="http://schemas.microsoft.com/office/drawing/2015/9/8/chartex" xmlns:cx2="http://schemas.microsoft.com/office/drawing/2015/10/21/chartex" xmlns:cx3="http://schemas.microsoft.com/office/drawing/2016/5/9/chartex" xmlns:cx4="http://schemas.microsoft.com/office/drawing/2016/5/10/chartex" xmlns:cx5="http://schemas.microsoft.com/office/drawing/2016/5/11/chartex" xmlns:cx6="http://schemas.microsoft.com/office/drawing/2016/5/12/chartex" xmlns:cx7="http://schemas.microsoft.com/office/drawing/2016/5/13/chartex" xmlns:cx8="http://schemas.microsoft.com/office/drawing/2016/5/14/chartex" xmlns:mc="http://schemas.openxmlformats.org/markup-compatibility/2006" xmlns:aink="http://schemas.microsoft.com/office/drawing/2016/ink" xmlns:am3d="http://schemas.microsoft.com/office/drawing/2017/model3d" xmlns:o="urn:schemas-microsoft-com:office:office" xmlns:oel="http://schemas.microsoft.com/office/2019/extlst" xmlns:r="http://schemas.openxmlformats.org/officeDocument/2006/relationships" xmlns:m="http://schemas.openxmlformats.org/officeDocument/2006/math" xmlns:v="urn:schemas-microsoft-com:vml" xmlns:wp14="http://schemas.microsoft.com/office/word/2010/wordprocessingDrawing" xmlns:wp="http://schemas.openxmlformats.org/drawingml/2006/wordprocessingDrawing" xmlns:w10="urn:schemas-microsoft-com:office:word" xmlns:w="http://schemas.openxmlformats.org/wordprocessingml/2006/main" xmlns:w14="http://schemas.microsoft.com/office/word/2010/wordml" xmlns:w15="http://schemas.microsoft.com/office/word/2012/wordml" xmlns:w16cex="http://schemas.microsoft.com/office/word/2018/wordml/cex" xmlns:w16cid="http://schemas.microsoft.com/office/word/2016/wordml/cid" xmlns:w16="http://schemas.microsoft.com/office/word/2018/wordml" xmlns:w16du="http://schemas.microsoft.com/office/word/2023/wordml/word16du" xmlns:w16sdtdh="http://schemas.microsoft.com/office/word/2020/wordml/sdtdatahash" xmlns:w16sdtfl="http://schemas.microsoft.com/office/word/2024/wordml/sdtformatlock" xmlns:w16se="http://schemas.microsoft.com/office/word/2015/wordml/symex" xmlns:wpg="http://schemas.microsoft.com/office/word/2010/wordprocessingGroup" xmlns:wpi="http://schemas.microsoft.com/office/word/2010/wordprocessingInk" xmlns:wne="http://schemas.microsoft.com/office/word/2006/wordml" xmlns:wps="http://schemas.microsoft.com/office/word/2010/wordprocessingShape" mc:Ignorable="w14 w15 w16se w16cid w16 w16cex w16sdtdh w16sdtfl w16du wp14">
+  <w:abstractNum w:abstractNumId="0" w15:restartNumberingAfterBreak="0">
+    <w:nsid w:val="09E82EA5"/>
+    <w:multiLevelType w:val="hybridMultilevel"/>
+    <w:tmpl w:val="55EEFEAC"/>
+    <w:lvl w:ilvl="0" w:tplc="04090001">
+      <w:start w:val="1"/>
+      <w:numFmt w:val="bullet"/>
+      <w:lvlText w:val=""/>
+      <w:lvlJc w:val="left"/>
+      <w:pPr>
+        <w:ind w:left="720" w:hanging="360"/>
+      </w:pPr>
+      <w:rPr>
+        <w:rFonts w:ascii="Symbol" w:hAnsi="Symbol" w:hint="default"/>
+      </w:rPr>
+    </w:lvl>
+    <w:lvl w:ilvl="1" w:tplc="04090003">
+      <w:start w:val="1"/>
+      <w:numFmt w:val="bullet"/>
+      <w:lvlText w:val="o"/>
+      <w:lvlJc w:val="left"/>
+      <w:pPr>
+        <w:ind w:left="1440" w:hanging="360"/>
+      </w:pPr>
+      <w:rPr>
+        <w:rFonts w:ascii="Courier New" w:hAnsi="Courier New" w:cs="Courier New" w:hint="default"/>
+      </w:rPr>
+    </w:lvl>
+    <w:lvl w:ilvl="2" w:tplc="04090005" w:tentative="1">
+      <w:start w:val="1"/>
+      <w:numFmt w:val="bullet"/>
+      <w:lvlText w:val=""/>
+      <w:lvlJc w:val="left"/>
+      <w:pPr>
+        <w:ind w:left="2160" w:hanging="360"/>
+      </w:pPr>
+      <w:rPr>
+        <w:rFonts w:ascii="Wingdings" w:hAnsi="Wingdings" w:hint="default"/>
+      </w:rPr>
+    </w:lvl>
+    <w:lvl w:ilvl="3" w:tplc="04090001" w:tentative="1">
+      <w:start w:val="1"/>
+      <w:numFmt w:val="bullet"/>
+      <w:lvlText w:val=""/>
+      <w:lvlJc w:val="left"/>
+      <w:pPr>
+        <w:ind w:left="2880" w:hanging="360"/>
+      </w:pPr>
+      <w:rPr>
+        <w:rFonts w:ascii="Symbol" w:hAnsi="Symbol" w:hint="default"/>
+      </w:rPr>
+    </w:lvl>
+    <w:lvl w:ilvl="4" w:tplc="04090003" w:tentative="1">
+      <w:start w:val="1"/>
+      <w:numFmt w:val="bullet"/>
+      <w:lvlText w:val="o"/>
+      <w:lvlJc w:val="left"/>
+      <w:pPr>
+        <w:ind w:left="3600" w:hanging="360"/>
+      </w:pPr>
+      <w:rPr>
+        <w:rFonts w:ascii="Courier New" w:hAnsi="Courier New" w:cs="Courier New" w:hint="default"/>
+      </w:rPr>
+    </w:lvl>
+    <w:lvl w:ilvl="5" w:tplc="04090005" w:tentative="1">
+      <w:start w:val="1"/>
+      <w:numFmt w:val="bullet"/>
+      <w:lvlText w:val=""/>
+      <w:lvlJc w:val="left"/>
+      <w:pPr>
+        <w:ind w:left="4320" w:hanging="360"/>
+      </w:pPr>
+      <w:rPr>
+        <w:rFonts w:ascii="Wingdings" w:hAnsi="Wingdings" w:hint="default"/>
+      </w:rPr>
+    </w:lvl>
+    <w:lvl w:ilvl="6" w:tplc="04090001" w:tentative="1">
+      <w:start w:val="1"/>
+      <w:numFmt w:val="bullet"/>
+      <w:lvlText w:val=""/>
+      <w:lvlJc w:val="left"/>
+      <w:pPr>
+        <w:ind w:left="5040" w:hanging="360"/>
+      </w:pPr>
+      <w:rPr>
+        <w:rFonts w:ascii="Symbol" w:hAnsi="Symbol" w:hint="default"/>
+      </w:rPr>
+    </w:lvl>
+    <w:lvl w:ilvl="7" w:tplc="04090003" w:tentative="1">
+      <w:start w:val="1"/>
+      <w:numFmt w:val="bullet"/>
+      <w:lvlText w:val="o"/>
+      <w:lvlJc w:val="left"/>
+      <w:pPr>
+        <w:ind w:left="5760" w:hanging="360"/>
+      </w:pPr>
+      <w:rPr>
+        <w:rFonts w:ascii="Courier New" w:hAnsi="Courier New" w:cs="Courier New" w:hint="default"/>
+      </w:rPr>
+    </w:lvl>
+    <w:lvl w:ilvl="8" w:tplc="04090005" w:tentative="1">
+      <w:start w:val="1"/>
+      <w:numFmt w:val="bullet"/>
+      <w:lvlText w:val=""/>
+      <w:lvlJc w:val="left"/>
+      <w:pPr>
+        <w:ind w:left="6480" w:hanging="360"/>
+      </w:pPr>
+      <w:rPr>
+        <w:rFonts w:ascii="Wingdings" w:hAnsi="Wingdings" w:hint="default"/>
+      </w:rPr>
+    </w:lvl>
+  </w:abstractNum>
+  <w:abstractNum w:abstractNumId="1" w15:restartNumberingAfterBreak="0">
+    <w:nsid w:val="0BCC3684"/>
+    <w:multiLevelType w:val="hybridMultilevel"/>
+    <w:tmpl w:val="8738D77A"/>
+    <w:lvl w:ilvl="0" w:tplc="431CFC58">
+      <w:numFmt w:val="bullet"/>
+      <w:lvlText w:val=""/>
+      <w:lvlJc w:val="left"/>
+      <w:pPr>
+        <w:ind w:left="720" w:hanging="360"/>
+      </w:pPr>
+      <w:rPr>
+        <w:rFonts w:ascii="Symbol" w:eastAsiaTheme="minorHAnsi" w:hAnsi="Symbol" w:cstheme="minorBidi" w:hint="default"/>
+      </w:rPr>
+    </w:lvl>
+    <w:lvl w:ilvl="1" w:tplc="04090003">
+      <w:start w:val="1"/>
+      <w:numFmt w:val="bullet"/>
+      <w:lvlText w:val="o"/>
+      <w:lvlJc w:val="left"/>
+      <w:pPr>
+        <w:ind w:left="1440" w:hanging="360"/>
+      </w:pPr>
+      <w:rPr>
+        <w:rFonts w:ascii="Courier New" w:hAnsi="Courier New" w:cs="Courier New" w:hint="default"/>
+      </w:rPr>
+    </w:lvl>
+    <w:lvl w:ilvl="2" w:tplc="04090005" w:tentative="1">
+      <w:start w:val="1"/>
+      <w:numFmt w:val="bullet"/>
+      <w:lvlText w:val=""/>
+      <w:lvlJc w:val="left"/>
+      <w:pPr>
+        <w:ind w:left="2160" w:hanging="360"/>
+      </w:pPr>
+      <w:rPr>
+        <w:rFonts w:ascii="Wingdings" w:hAnsi="Wingdings" w:hint="default"/>
+      </w:rPr>
+    </w:lvl>
+    <w:lvl w:ilvl="3" w:tplc="04090001" w:tentative="1">
+      <w:start w:val="1"/>
+      <w:numFmt w:val="bullet"/>
+      <w:lvlText w:val=""/>
+      <w:lvlJc w:val="left"/>
+      <w:pPr>
+        <w:ind w:left="2880" w:hanging="360"/>
+      </w:pPr>
+      <w:rPr>
+        <w:rFonts w:ascii="Symbol" w:hAnsi="Symbol" w:hint="default"/>
+      </w:rPr>
+    </w:lvl>
+    <w:lvl w:ilvl="4" w:tplc="04090003" w:tentative="1">
+      <w:start w:val="1"/>
+      <w:numFmt w:val="bullet"/>
+      <w:lvlText w:val="o"/>
+      <w:lvlJc w:val="left"/>
+      <w:pPr>
+        <w:ind w:left="3600" w:hanging="360"/>
+      </w:pPr>
+      <w:rPr>
+        <w:rFonts w:ascii="Courier New" w:hAnsi="Courier New" w:cs="Courier New" w:hint="default"/>
+      </w:rPr>
+    </w:lvl>
+    <w:lvl w:ilvl="5" w:tplc="04090005" w:tentative="1">
+      <w:start w:val="1"/>
+      <w:numFmt w:val="bullet"/>
+      <w:lvlText w:val=""/>
+      <w:lvlJc w:val="left"/>
+      <w:pPr>
+        <w:ind w:left="4320" w:hanging="360"/>
+      </w:pPr>
+      <w:rPr>
+        <w:rFonts w:ascii="Wingdings" w:hAnsi="Wingdings" w:hint="default"/>
+      </w:rPr>
+    </w:lvl>
+    <w:lvl w:ilvl="6" w:tplc="04090001" w:tentative="1">
+      <w:start w:val="1"/>
+      <w:numFmt w:val="bullet"/>
+      <w:lvlText w:val=""/>
+      <w:lvlJc w:val="left"/>
+      <w:pPr>
+        <w:ind w:left="5040" w:hanging="360"/>
+      </w:pPr>
+      <w:rPr>
+        <w:rFonts w:ascii="Symbol" w:hAnsi="Symbol" w:hint="default"/>
+      </w:rPr>
+    </w:lvl>
+    <w:lvl w:ilvl="7" w:tplc="04090003" w:tentative="1">
+      <w:start w:val="1"/>
+      <w:numFmt w:val="bullet"/>
+      <w:lvlText w:val="o"/>
+      <w:lvlJc w:val="left"/>
+      <w:pPr>
+        <w:ind w:left="5760" w:hanging="360"/>
+      </w:pPr>
+      <w:rPr>
+        <w:rFonts w:ascii="Courier New" w:hAnsi="Courier New" w:cs="Courier New" w:hint="default"/>
+      </w:rPr>
+    </w:lvl>
+    <w:lvl w:ilvl="8" w:tplc="04090005" w:tentative="1">
+      <w:start w:val="1"/>
+      <w:numFmt w:val="bullet"/>
+      <w:lvlText w:val=""/>
+      <w:lvlJc w:val="left"/>
+      <w:pPr>
+        <w:ind w:left="6480" w:hanging="360"/>
+      </w:pPr>
+      <w:rPr>
+        <w:rFonts w:ascii="Wingdings" w:hAnsi="Wingdings" w:hint="default"/>
+      </w:rPr>
+    </w:lvl>
+  </w:abstractNum>
+  <w:abstractNum w:abstractNumId="2" w15:restartNumberingAfterBreak="0">
+    <w:nsid w:val="44E008ED"/>
+    <w:multiLevelType w:val="hybridMultilevel"/>
+    <w:tmpl w:val="E4D692F8"/>
+    <w:lvl w:ilvl="0" w:tplc="04090001">
+      <w:start w:val="1"/>
+      <w:numFmt w:val="bullet"/>
+      <w:lvlText w:val=""/>
+      <w:lvlJc w:val="left"/>
+      <w:pPr>
+        <w:ind w:left="720" w:hanging="360"/>
+      </w:pPr>
+      <w:rPr>
+        <w:rFonts w:ascii="Symbol" w:hAnsi="Symbol" w:hint="default"/>
+      </w:rPr>
+    </w:lvl>
+    <w:lvl w:ilvl="1" w:tplc="E08035C6">
+      <w:numFmt w:val="bullet"/>
+      <w:lvlText w:val="-"/>
+      <w:lvlJc w:val="left"/>
+      <w:pPr>
+        <w:ind w:left="1440" w:hanging="360"/>
+      </w:pPr>
+      <w:rPr>
+        <w:rFonts w:ascii="Aptos" w:eastAsiaTheme="minorHAnsi" w:hAnsi="Aptos" w:cstheme="minorBidi" w:hint="default"/>
+      </w:rPr>
+    </w:lvl>
+    <w:lvl w:ilvl="2" w:tplc="04090005" w:tentative="1">
+      <w:start w:val="1"/>
+      <w:numFmt w:val="bullet"/>
+      <w:lvlText w:val=""/>
+      <w:lvlJc w:val="left"/>
+      <w:pPr>
+        <w:ind w:left="2160" w:hanging="360"/>
+      </w:pPr>
+      <w:rPr>
+        <w:rFonts w:ascii="Wingdings" w:hAnsi="Wingdings" w:hint="default"/>
+      </w:rPr>
+    </w:lvl>
+    <w:lvl w:ilvl="3" w:tplc="04090001" w:tentative="1">
+      <w:start w:val="1"/>
+      <w:numFmt w:val="bullet"/>
+      <w:lvlText w:val=""/>
+      <w:lvlJc w:val="left"/>
+      <w:pPr>
+        <w:ind w:left="2880" w:hanging="360"/>
+      </w:pPr>
+      <w:rPr>
+        <w:rFonts w:ascii="Symbol" w:hAnsi="Symbol" w:hint="default"/>
+      </w:rPr>
+    </w:lvl>
+    <w:lvl w:ilvl="4" w:tplc="04090003" w:tentative="1">
+      <w:start w:val="1"/>
+      <w:numFmt w:val="bullet"/>
+      <w:lvlText w:val="o"/>
+      <w:lvlJc w:val="left"/>
+      <w:pPr>
+        <w:ind w:left="3600" w:hanging="360"/>
+      </w:pPr>
+      <w:rPr>
+        <w:rFonts w:ascii="Courier New" w:hAnsi="Courier New" w:cs="Courier New" w:hint="default"/>
+      </w:rPr>
+    </w:lvl>
+    <w:lvl w:ilvl="5" w:tplc="04090005" w:tentative="1">
+      <w:start w:val="1"/>
+      <w:numFmt w:val="bullet"/>
+      <w:lvlText w:val=""/>
+      <w:lvlJc w:val="left"/>
+      <w:pPr>
+        <w:ind w:left="4320" w:hanging="360"/>
+      </w:pPr>
+      <w:rPr>
+        <w:rFonts w:ascii="Wingdings" w:hAnsi="Wingdings" w:hint="default"/>
+      </w:rPr>
+    </w:lvl>
+    <w:lvl w:ilvl="6" w:tplc="04090001" w:tentative="1">
+      <w:start w:val="1"/>
+      <w:numFmt w:val="bullet"/>
+      <w:lvlText w:val=""/>
+      <w:lvlJc w:val="left"/>
+      <w:pPr>
+        <w:ind w:left="5040" w:hanging="360"/>
+      </w:pPr>
+      <w:rPr>
+        <w:rFonts w:ascii="Symbol" w:hAnsi="Symbol" w:hint="default"/>
+      </w:rPr>
+    </w:lvl>
+    <w:lvl w:ilvl="7" w:tplc="04090003" w:tentative="1">
+      <w:start w:val="1"/>
+      <w:numFmt w:val="bullet"/>
+      <w:lvlText w:val="o"/>
+      <w:lvlJc w:val="left"/>
+      <w:pPr>
+        <w:ind w:left="5760" w:hanging="360"/>
+      </w:pPr>
+      <w:rPr>
+        <w:rFonts w:ascii="Courier New" w:hAnsi="Courier New" w:cs="Courier New" w:hint="default"/>
+      </w:rPr>
+    </w:lvl>
+    <w:lvl w:ilvl="8" w:tplc="04090005" w:tentative="1">
+      <w:start w:val="1"/>
+      <w:numFmt w:val="bullet"/>
+      <w:lvlText w:val=""/>
+      <w:lvlJc w:val="left"/>
+      <w:pPr>
+        <w:ind w:left="6480" w:hanging="360"/>
+      </w:pPr>
+      <w:rPr>
+        <w:rFonts w:ascii="Wingdings" w:hAnsi="Wingdings" w:hint="default"/>
+      </w:rPr>
+    </w:lvl>
+  </w:abstractNum>
+  <w:abstractNum w:abstractNumId="3" w15:restartNumberingAfterBreak="0">
+    <w:nsid w:val="508D7114"/>
+    <w:multiLevelType w:val="hybridMultilevel"/>
+    <w:tmpl w:val="A424AACC"/>
+    <w:lvl w:ilvl="0" w:tplc="04090001">
+      <w:start w:val="1"/>
+      <w:numFmt w:val="bullet"/>
+      <w:lvlText w:val=""/>
+      <w:lvlJc w:val="left"/>
+      <w:pPr>
+        <w:ind w:left="720" w:hanging="360"/>
+      </w:pPr>
+      <w:rPr>
+        <w:rFonts w:ascii="Symbol" w:hAnsi="Symbol" w:hint="default"/>
+      </w:rPr>
+    </w:lvl>
+    <w:lvl w:ilvl="1" w:tplc="04090003" w:tentative="1">
+      <w:start w:val="1"/>
+      <w:numFmt w:val="bullet"/>
+      <w:lvlText w:val="o"/>
+      <w:lvlJc w:val="left"/>
+      <w:pPr>
+        <w:ind w:left="1440" w:hanging="360"/>
+      </w:pPr>
+      <w:rPr>
+        <w:rFonts w:ascii="Courier New" w:hAnsi="Courier New" w:cs="Courier New" w:hint="default"/>
+      </w:rPr>
+    </w:lvl>
+    <w:lvl w:ilvl="2" w:tplc="04090005" w:tentative="1">
+      <w:start w:val="1"/>
+      <w:numFmt w:val="bullet"/>
+      <w:lvlText w:val=""/>
+      <w:lvlJc w:val="left"/>
+      <w:pPr>
+        <w:ind w:left="2160" w:hanging="360"/>
+      </w:pPr>
+      <w:rPr>
+        <w:rFonts w:ascii="Wingdings" w:hAnsi="Wingdings" w:hint="default"/>
+      </w:rPr>
+    </w:lvl>
+    <w:lvl w:ilvl="3" w:tplc="04090001" w:tentative="1">
+      <w:start w:val="1"/>
+      <w:numFmt w:val="bullet"/>
+      <w:lvlText w:val=""/>
+      <w:lvlJc w:val="left"/>
+      <w:pPr>
+        <w:ind w:left="2880" w:hanging="360"/>
+      </w:pPr>
+      <w:rPr>
+        <w:rFonts w:ascii="Symbol" w:hAnsi="Symbol" w:hint="default"/>
+      </w:rPr>
+    </w:lvl>
+    <w:lvl w:ilvl="4" w:tplc="04090003" w:tentative="1">
+      <w:start w:val="1"/>
+      <w:numFmt w:val="bullet"/>
+      <w:lvlText w:val="o"/>
+      <w:lvlJc w:val="left"/>
+      <w:pPr>
+        <w:ind w:left="3600" w:hanging="360"/>
+      </w:pPr>
+      <w:rPr>
+        <w:rFonts w:ascii="Courier New" w:hAnsi="Courier New" w:cs="Courier New" w:hint="default"/>
+      </w:rPr>
+    </w:lvl>
+    <w:lvl w:ilvl="5" w:tplc="04090005" w:tentative="1">
+      <w:start w:val="1"/>
+      <w:numFmt w:val="bullet"/>
+      <w:lvlText w:val=""/>
+      <w:lvlJc w:val="left"/>
+      <w:pPr>
+        <w:ind w:left="4320" w:hanging="360"/>
+      </w:pPr>
+      <w:rPr>
+        <w:rFonts w:ascii="Wingdings" w:hAnsi="Wingdings" w:hint="default"/>
+      </w:rPr>
+    </w:lvl>
+    <w:lvl w:ilvl="6" w:tplc="04090001" w:tentative="1">
+      <w:start w:val="1"/>
+      <w:numFmt w:val="bullet"/>
+      <w:lvlText w:val=""/>
+      <w:lvlJc w:val="left"/>
+      <w:pPr>
+        <w:ind w:left="5040" w:hanging="360"/>
+      </w:pPr>
+      <w:rPr>
+        <w:rFonts w:ascii="Symbol" w:hAnsi="Symbol" w:hint="default"/>
+      </w:rPr>
+    </w:lvl>
+    <w:lvl w:ilvl="7" w:tplc="04090003" w:tentative="1">
+      <w:start w:val="1"/>
+      <w:numFmt w:val="bullet"/>
+      <w:lvlText w:val="o"/>
+      <w:lvlJc w:val="left"/>
+      <w:pPr>
+        <w:ind w:left="5760" w:hanging="360"/>
+      </w:pPr>
+      <w:rPr>
+        <w:rFonts w:ascii="Courier New" w:hAnsi="Courier New" w:cs="Courier New" w:hint="default"/>
+      </w:rPr>
+    </w:lvl>
+    <w:lvl w:ilvl="8" w:tplc="04090005" w:tentative="1">
+      <w:start w:val="1"/>
+      <w:numFmt w:val="bullet"/>
+      <w:lvlText w:val=""/>
+      <w:lvlJc w:val="left"/>
+      <w:pPr>
+        <w:ind w:left="6480" w:hanging="360"/>
+      </w:pPr>
+      <w:rPr>
+        <w:rFonts w:ascii="Wingdings" w:hAnsi="Wingdings" w:hint="default"/>
+      </w:rPr>
+    </w:lvl>
+  </w:abstractNum>
+  <w:abstractNum w:abstractNumId="4" w15:restartNumberingAfterBreak="0">
+    <w:nsid w:val="543708E0"/>
+    <w:multiLevelType w:val="hybridMultilevel"/>
+    <w:tmpl w:val="4CF60DC2"/>
+    <w:lvl w:ilvl="0" w:tplc="04090001">
+      <w:start w:val="1"/>
+      <w:numFmt w:val="bullet"/>
+      <w:lvlText w:val=""/>
+      <w:lvlJc w:val="left"/>
+      <w:pPr>
+        <w:ind w:left="720" w:hanging="360"/>
+      </w:pPr>
+      <w:rPr>
+        <w:rFonts w:ascii="Symbol" w:hAnsi="Symbol" w:hint="default"/>
+      </w:rPr>
+    </w:lvl>
+    <w:lvl w:ilvl="1" w:tplc="04090003" w:tentative="1">
+      <w:start w:val="1"/>
+      <w:numFmt w:val="bullet"/>
+      <w:lvlText w:val="o"/>
+      <w:lvlJc w:val="left"/>
+      <w:pPr>
+        <w:ind w:left="1440" w:hanging="360"/>
+      </w:pPr>
+      <w:rPr>
+        <w:rFonts w:ascii="Courier New" w:hAnsi="Courier New" w:cs="Courier New" w:hint="default"/>
+      </w:rPr>
+    </w:lvl>
+    <w:lvl w:ilvl="2" w:tplc="04090005" w:tentative="1">
+      <w:start w:val="1"/>
+      <w:numFmt w:val="bullet"/>
+      <w:lvlText w:val=""/>
+      <w:lvlJc w:val="left"/>
+      <w:pPr>
+        <w:ind w:left="2160" w:hanging="360"/>
+      </w:pPr>
+      <w:rPr>
+        <w:rFonts w:ascii="Wingdings" w:hAnsi="Wingdings" w:hint="default"/>
+      </w:rPr>
+    </w:lvl>
+    <w:lvl w:ilvl="3" w:tplc="04090001" w:tentative="1">
+      <w:start w:val="1"/>
+      <w:numFmt w:val="bullet"/>
+      <w:lvlText w:val=""/>
+      <w:lvlJc w:val="left"/>
+      <w:pPr>
+        <w:ind w:left="2880" w:hanging="360"/>
+      </w:pPr>
+      <w:rPr>
+        <w:rFonts w:ascii="Symbol" w:hAnsi="Symbol" w:hint="default"/>
+      </w:rPr>
+    </w:lvl>
+    <w:lvl w:ilvl="4" w:tplc="04090003" w:tentative="1">
+      <w:start w:val="1"/>
+      <w:numFmt w:val="bullet"/>
+      <w:lvlText w:val="o"/>
+      <w:lvlJc w:val="left"/>
+      <w:pPr>
+        <w:ind w:left="3600" w:hanging="360"/>
+      </w:pPr>
+      <w:rPr>
+        <w:rFonts w:ascii="Courier New" w:hAnsi="Courier New" w:cs="Courier New" w:hint="default"/>
+      </w:rPr>
+    </w:lvl>
+    <w:lvl w:ilvl="5" w:tplc="04090005" w:tentative="1">
+      <w:start w:val="1"/>
+      <w:numFmt w:val="bullet"/>
+      <w:lvlText w:val=""/>
+      <w:lvlJc w:val="left"/>
+      <w:pPr>
+        <w:ind w:left="4320" w:hanging="360"/>
+      </w:pPr>
+      <w:rPr>
+        <w:rFonts w:ascii="Wingdings" w:hAnsi="Wingdings" w:hint="default"/>
+      </w:rPr>
+    </w:lvl>
+    <w:lvl w:ilvl="6" w:tplc="04090001" w:tentative="1">
+      <w:start w:val="1"/>
+      <w:numFmt w:val="bullet"/>
+      <w:lvlText w:val=""/>
+      <w:lvlJc w:val="left"/>
+      <w:pPr>
+        <w:ind w:left="5040" w:hanging="360"/>
+      </w:pPr>
+      <w:rPr>
+        <w:rFonts w:ascii="Symbol" w:hAnsi="Symbol" w:hint="default"/>
+      </w:rPr>
+    </w:lvl>
+    <w:lvl w:ilvl="7" w:tplc="04090003" w:tentative="1">
+      <w:start w:val="1"/>
+      <w:numFmt w:val="bullet"/>
+      <w:lvlText w:val="o"/>
+      <w:lvlJc w:val="left"/>
+      <w:pPr>
+        <w:ind w:left="5760" w:hanging="360"/>
+      </w:pPr>
+      <w:rPr>
+        <w:rFonts w:ascii="Courier New" w:hAnsi="Courier New" w:cs="Courier New" w:hint="default"/>
+      </w:rPr>
+    </w:lvl>
+    <w:lvl w:ilvl="8" w:tplc="04090005" w:tentative="1">
+      <w:start w:val="1"/>
+      <w:numFmt w:val="bullet"/>
+      <w:lvlText w:val=""/>
+      <w:lvlJc w:val="left"/>
+      <w:pPr>
+        <w:ind w:left="6480" w:hanging="360"/>
+      </w:pPr>
+      <w:rPr>
+        <w:rFonts w:ascii="Wingdings" w:hAnsi="Wingdings" w:hint="default"/>
+      </w:rPr>
+    </w:lvl>
+  </w:abstractNum>
+  <w:abstractNum w:abstractNumId="5" w15:restartNumberingAfterBreak="0">
+    <w:nsid w:val="57EF348C"/>
+    <w:multiLevelType w:val="hybridMultilevel"/>
+    <w:tmpl w:val="005E69B6"/>
+    <w:lvl w:ilvl="0" w:tplc="E4A8BA62">
+      <w:numFmt w:val="bullet"/>
+      <w:lvlText w:val="-"/>
+      <w:lvlJc w:val="left"/>
+      <w:pPr>
+        <w:ind w:left="720" w:hanging="360"/>
+      </w:pPr>
+      <w:rPr>
+        <w:rFonts w:ascii="Aptos" w:eastAsiaTheme="minorHAnsi" w:hAnsi="Aptos" w:cstheme="minorBidi" w:hint="default"/>
+      </w:rPr>
+    </w:lvl>
+    <w:lvl w:ilvl="1" w:tplc="C9C2C820">
+      <w:numFmt w:val="bullet"/>
+      <w:lvlText w:val=""/>
+      <w:lvlJc w:val="left"/>
+      <w:pPr>
+        <w:ind w:left="1440" w:hanging="360"/>
+      </w:pPr>
+      <w:rPr>
+        <w:rFonts w:ascii="Wingdings" w:eastAsiaTheme="minorHAnsi" w:hAnsi="Wingdings" w:cstheme="minorBidi" w:hint="default"/>
+      </w:rPr>
+    </w:lvl>
+    <w:lvl w:ilvl="2" w:tplc="04090005" w:tentative="1">
+      <w:start w:val="1"/>
+      <w:numFmt w:val="bullet"/>
+      <w:lvlText w:val=""/>
+      <w:lvlJc w:val="left"/>
+      <w:pPr>
+        <w:ind w:left="2160" w:hanging="360"/>
+      </w:pPr>
+      <w:rPr>
+        <w:rFonts w:ascii="Wingdings" w:hAnsi="Wingdings" w:hint="default"/>
+      </w:rPr>
+    </w:lvl>
+    <w:lvl w:ilvl="3" w:tplc="04090001" w:tentative="1">
+      <w:start w:val="1"/>
+      <w:numFmt w:val="bullet"/>
+      <w:lvlText w:val=""/>
+      <w:lvlJc w:val="left"/>
+      <w:pPr>
+        <w:ind w:left="2880" w:hanging="360"/>
+      </w:pPr>
+      <w:rPr>
+        <w:rFonts w:ascii="Symbol" w:hAnsi="Symbol" w:hint="default"/>
+      </w:rPr>
+    </w:lvl>
+    <w:lvl w:ilvl="4" w:tplc="04090003" w:tentative="1">
+      <w:start w:val="1"/>
+      <w:numFmt w:val="bullet"/>
+      <w:lvlText w:val="o"/>
+      <w:lvlJc w:val="left"/>
+      <w:pPr>
+        <w:ind w:left="3600" w:hanging="360"/>
+      </w:pPr>
+      <w:rPr>
+        <w:rFonts w:ascii="Courier New" w:hAnsi="Courier New" w:cs="Courier New" w:hint="default"/>
+      </w:rPr>
+    </w:lvl>
+    <w:lvl w:ilvl="5" w:tplc="04090005" w:tentative="1">
+      <w:start w:val="1"/>
+      <w:numFmt w:val="bullet"/>
+      <w:lvlText w:val=""/>
+      <w:lvlJc w:val="left"/>
+      <w:pPr>
+        <w:ind w:left="4320" w:hanging="360"/>
+      </w:pPr>
+      <w:rPr>
+        <w:rFonts w:ascii="Wingdings" w:hAnsi="Wingdings" w:hint="default"/>
+      </w:rPr>
+    </w:lvl>
+    <w:lvl w:ilvl="6" w:tplc="04090001" w:tentative="1">
+      <w:start w:val="1"/>
+      <w:numFmt w:val="bullet"/>
+      <w:lvlText w:val=""/>
+      <w:lvlJc w:val="left"/>
+      <w:pPr>
+        <w:ind w:left="5040" w:hanging="360"/>
+      </w:pPr>
+      <w:rPr>
+        <w:rFonts w:ascii="Symbol" w:hAnsi="Symbol" w:hint="default"/>
+      </w:rPr>
+    </w:lvl>
+    <w:lvl w:ilvl="7" w:tplc="04090003" w:tentative="1">
+      <w:start w:val="1"/>
+      <w:numFmt w:val="bullet"/>
+      <w:lvlText w:val="o"/>
+      <w:lvlJc w:val="left"/>
+      <w:pPr>
+        <w:ind w:left="5760" w:hanging="360"/>
+      </w:pPr>
+      <w:rPr>
+        <w:rFonts w:ascii="Courier New" w:hAnsi="Courier New" w:cs="Courier New" w:hint="default"/>
+      </w:rPr>
+    </w:lvl>
+    <w:lvl w:ilvl="8" w:tplc="04090005" w:tentative="1">
+      <w:start w:val="1"/>
+      <w:numFmt w:val="bullet"/>
+      <w:lvlText w:val=""/>
+      <w:lvlJc w:val="left"/>
+      <w:pPr>
+        <w:ind w:left="6480" w:hanging="360"/>
+      </w:pPr>
+      <w:rPr>
+        <w:rFonts w:ascii="Wingdings" w:hAnsi="Wingdings" w:hint="default"/>
+      </w:rPr>
+    </w:lvl>
+  </w:abstractNum>
+  <w:num w:numId="1" w16cid:durableId="1321349735">
+    <w:abstractNumId w:val="2"/>
+  </w:num>
+  <w:num w:numId="2" w16cid:durableId="497117523">
+    <w:abstractNumId w:val="3"/>
+  </w:num>
+  <w:num w:numId="3" w16cid:durableId="1202673938">
+    <w:abstractNumId w:val="4"/>
+  </w:num>
+  <w:num w:numId="4" w16cid:durableId="693382432">
+    <w:abstractNumId w:val="5"/>
+  </w:num>
+  <w:num w:numId="5" w16cid:durableId="1600213751">
+    <w:abstractNumId w:val="0"/>
+  </w:num>
+  <w:num w:numId="6" w16cid:durableId="265189524">
+    <w:abstractNumId w:val="1"/>
+  </w:num>
+</w:numbering>
 </file>
 
 <file path=word/styles.xml><?xml version="1.0" encoding="utf-8"?>

</xml_diff>